<commit_message>
Ficha Paso 1: hipótesis única y comparativa, siguiendo el modelo de clase
Co-Authored-By: Claude Opus 5.5 <noreply@anthropic.com>
Claude-Session: https://claude.ai/code/session_01QswC6zmgxEZXx5t9M6nqcy
</commit_message>
<xml_diff>
--- a/master-sistemas-inteligentes/metodologia-de-la-investigacion/practica-del-problema-al-articulo/paso-1-planteamiento/ficha-paso-1.docx
+++ b/master-sistemas-inteligentes/metodologia-de-la-investigacion/practica-del-problema-al-articulo/paso-1-planteamiento/ficha-paso-1.docx
@@ -283,31 +283,15 @@
           <w:bottom w:val="single" w:sz="6" w:space="3" w:color="000000"/>
           <w:right w:val="single" w:sz="6" w:space="3" w:color="000000"/>
         </w:pBdr>
-        <w:spacing w:after="0"/>
+        <w:spacing/>
         <w:ind w:left="85" w:right="85"/>
         <w:jc w:val="both"/>
       </w:pPr>
       <w:r>
         <w:rPr>
-          <w:b/>
+          <w:b w:val="0"/>
         </w:rPr>
-        <w:t>H</w:t>
-      </w:r>
-      <w:r>
-        <w:rPr>
-          <w:b/>
-          <w:vertAlign w:val="subscript"/>
-        </w:rPr>
-        <w:t>1</w:t>
-      </w:r>
-      <w:r>
-        <w:rPr>
-          <w:b/>
-        </w:rPr>
-        <w:t xml:space="preserve">: </w:t>
-      </w:r>
-      <w:r>
-        <w:t>un modelo de aprendizaje automático entrenado con parámetros del enlace podrá determinar si un canal cumple el umbral BER ≤ 10</w:t>
+        <w:t>Si se entrena un modelo de aprendizaje automático con los parámetros de los enlaces de la red (longitud, atenuación, empalmes, potencia y envejecimiento), será posible determinar si un canal cumple el umbral BER ≤ 10</w:t>
       </w:r>
       <w:r>
         <w:rPr>
@@ -316,41 +300,7 @@
         <w:t>−11</w:t>
       </w:r>
       <w:r>
-        <w:t xml:space="preserve"> con una exactitud de al menos el 95 %, en un tiempo de cálculo inferior al del método analítico.</w:t>
-      </w:r>
-    </w:p>
-    <w:p>
-      <w:pPr>
-        <w:pBdr>
-          <w:top w:val="single" w:sz="6" w:space="3" w:color="000000"/>
-          <w:left w:val="single" w:sz="6" w:space="3" w:color="000000"/>
-          <w:bottom w:val="single" w:sz="6" w:space="3" w:color="000000"/>
-          <w:right w:val="single" w:sz="6" w:space="3" w:color="000000"/>
-        </w:pBdr>
-        <w:ind w:left="85" w:right="85"/>
-        <w:jc w:val="both"/>
-      </w:pPr>
-      <w:r>
-        <w:rPr>
-          <w:b/>
-        </w:rPr>
-        <w:t>H</w:t>
-      </w:r>
-      <w:r>
-        <w:rPr>
-          <w:b/>
-          <w:vertAlign w:val="subscript"/>
-        </w:rPr>
-        <w:t>0</w:t>
-      </w:r>
-      <w:r>
-        <w:rPr>
-          <w:b/>
-        </w:rPr>
-        <w:t xml:space="preserve">: </w:t>
-      </w:r>
-      <w:r>
-        <w:t>los modelos de aprendizaje automático no mejoran de forma significativa al modelo de referencia sencillo.</w:t>
+        <w:t xml:space="preserve"> con una exactitud comparable a la del cálculo analítico y en un tiempo de cálculo mucho menor.</w:t>
       </w:r>
     </w:p>
     <w:p>

</xml_diff>

<commit_message>
Ficha Paso 1 v4: hipótesis comparativa, pregunta alineada y arreglos de la revisión independiente
Co-Authored-By: Claude Opus 5.5 <noreply@anthropic.com>
Claude-Session: https://claude.ai/code/session_01QswC6zmgxEZXx5t9M6nqcy
</commit_message>
<xml_diff>
--- a/master-sistemas-inteligentes/metodologia-de-la-investigacion/practica-del-problema-al-articulo/paso-1-planteamiento/ficha-paso-1.docx
+++ b/master-sistemas-inteligentes/metodologia-de-la-investigacion/practica-del-problema-al-articulo/paso-1-planteamiento/ficha-paso-1.docx
@@ -4,397 +4,521 @@
   <w:body>
     <w:p>
       <w:pPr>
-        <w:tabs>
-          <w:tab w:pos="10091" w:val="right"/>
-        </w:tabs>
+        <w:spacing w:after="80"/>
+        <w:jc w:val="center"/>
       </w:pPr>
       <w:r>
         <w:rPr>
-          <w:color w:val="333333"/>
-          <w:sz w:val="16"/>
+          <w:b/>
+          <w:i w:val="0"/>
         </w:rPr>
-        <w:t>Máster Universitario en Sistemas Inteligentes — USAL · Metodología de la Investigación</w:t>
-        <w:tab/>
-        <w:t>Paso 1 · Día 1</w:t>
+        <w:t>ESTIMACIÓN DE LA CALIDAD DE TRANSMISIÓN MEDIANTE APRENDIZAJE AUTOMÁTICO EN LA RED DWDM FERROVIARIA MOSCÚ-KAZÁNSKAYA – RIAZÁN</w:t>
       </w:r>
     </w:p>
     <w:p>
       <w:pPr>
-        <w:spacing w:after="20"/>
+        <w:jc w:val="center"/>
       </w:pPr>
       <w:r>
         <w:rPr>
-          <w:b/>
-          <w:sz w:val="25"/>
+          <w:b w:val="0"/>
+          <w:i w:val="0"/>
+          <w:sz w:val="20"/>
         </w:rPr>
-        <w:t>Estimación de la calidad de transmisión mediante aprendizaje automático en la red DWDM ferroviaria Moscú-Kazánskaya – Riazán</w:t>
+        <w:t>Angel Luis Acosta González</w:t>
+      </w:r>
+    </w:p>
+    <w:p>
+      <w:pPr>
+        <w:jc w:val="center"/>
+      </w:pPr>
+      <w:r>
+        <w:rPr>
+          <w:b w:val="0"/>
+          <w:i w:val="0"/>
+          <w:sz w:val="20"/>
+        </w:rPr>
+        <w:t>Máster Universitario en Sistemas Inteligentes (USAL) · Metodología de la Investigación</w:t>
       </w:r>
     </w:p>
     <w:p>
       <w:pPr>
         <w:pBdr>
-          <w:bottom w:val="single" w:sz="8" w:space="3" w:color="000000"/>
+          <w:bottom w:val="single" w:sz="6" w:space="4" w:color="000000"/>
         </w:pBdr>
-        <w:tabs>
-          <w:tab w:pos="10091" w:val="right"/>
-        </w:tabs>
+        <w:jc w:val="center"/>
       </w:pPr>
       <w:r>
         <w:rPr>
-          <w:color w:val="333333"/>
-          <w:sz w:val="16"/>
+          <w:b w:val="0"/>
+          <w:i w:val="0"/>
+          <w:sz w:val="20"/>
         </w:rPr>
-        <w:t>Angel Luis Acosta González</w:t>
-        <w:tab/>
-        <w:t>Título provisional · 28 de septiembre de 2026</w:t>
+        <w:t>Paso 1: Planteamiento del problema, pregunta e hipótesis · 28 de septiembre de 2026</w:t>
       </w:r>
     </w:p>
     <w:p>
       <w:pPr>
         <w:keepNext/>
-        <w:spacing w:before="120" w:after="20"/>
+        <w:spacing w:before="140" w:after="40"/>
+        <w:jc w:val="left"/>
       </w:pPr>
       <w:r>
         <w:rPr>
           <w:b/>
-          <w:smallCaps/>
-          <w:sz w:val="20"/>
+          <w:i w:val="0"/>
         </w:rPr>
-        <w:t>1. Planteamiento del problema</w:t>
+        <w:t>1. PLANTEAMIENTO DEL PROBLEMA</w:t>
       </w:r>
     </w:p>
     <w:p>
       <w:pPr>
+        <w:ind w:firstLine="709"/>
         <w:jc w:val="both"/>
       </w:pPr>
       <w:r>
-        <w:t>En mi trabajo de fin de grado (ingeniería ferroviaria, RUT MIIT, 2026) diseñé la red primaria de comunicaciones del tramo Moscú-Kazánskaya – Riazán-1 (198,3 km): un anillo DWDM entre Moscú-Kazánskaya, Voskresensk y Riazán-1, más una cadena de acceso de 22 estaciones, con canales de 10 Gbit/s sobre fibra G.652 (α = 0,22 dB/km). La calidad de transmisión (QoT) se verificó con un modelo analítico aplicado solo al tramo más desfavorable (Voskresensk – Riazán-1, 108,9 km). El resultado fue Q = 7,37 y BER = 8,9·10</w:t>
+        <w:rPr>
+          <w:b w:val="0"/>
+          <w:i w:val="0"/>
+        </w:rPr>
+        <w:t>Este trabajo parte del diseño que propuse en mi trabajo de fin de grado (RUT MIIT, 2026) para la red primaria de comunicaciones del tramo Moscú-Kazánskaya – Riazán-1 (198,3 km): un anillo DWDM entre Moscú-Kazánskaya, Voskresensk y Riazán-1, más una cadena de acceso de 22 estaciones, con canales de 10 Gbit/s sobre fibra G.652 (α = 0,22 dB/km). La calidad de transmisión (QoT) se verificó con un modelo analítico aplicado solo al tramo más desfavorable (Voskresensk – Riazán-1, 108,9 km). El resultado fue Q = 7,37 y BER = 8,9·10</w:t>
       </w:r>
       <w:r>
         <w:rPr>
+          <w:b w:val="0"/>
+          <w:i w:val="0"/>
           <w:vertAlign w:val="superscript"/>
         </w:rPr>
         <w:t>−14</w:t>
       </w:r>
       <w:r>
+        <w:rPr>
+          <w:b w:val="0"/>
+          <w:i w:val="0"/>
+        </w:rPr>
         <w:t>, frente a un umbral normativo de 10</w:t>
       </w:r>
       <w:r>
         <w:rPr>
+          <w:b w:val="0"/>
+          <w:i w:val="0"/>
           <w:vertAlign w:val="superscript"/>
         </w:rPr>
         <w:t>−11</w:t>
       </w:r>
       <w:r>
-        <w:t xml:space="preserve"> (Q = 6,71).</w:t>
+        <w:rPr>
+          <w:b w:val="0"/>
+          <w:i w:val="0"/>
+        </w:rPr>
+        <w:t xml:space="preserve"> (Q = 6,71).</w:t>
       </w:r>
     </w:p>
     <w:p>
       <w:pPr>
+        <w:ind w:firstLine="709"/>
         <w:jc w:val="both"/>
       </w:pPr>
       <w:r>
-        <w:t xml:space="preserve">Ese enfoque es </w:t>
+        <w:rPr>
+          <w:b w:val="0"/>
+          <w:i w:val="0"/>
+        </w:rPr>
+        <w:t>El enfoque utilizado en ese proyecto es estático y conservador: se calcula una sola vez, para un caso extremo y con márgenes fijos. No tiene en cuenta la degradación durante la explotación: envejecimiento de la fibra y de los amplificadores EDFA, empalmes por reparaciones o variaciones de temperatura. Tampoco recoge el hielo y las inundaciones, que el propio proyecto identifica como riesgos del trazado, ni la reconfiguración de canales en los OADM. Recalcular a mano cada canal óptico (</w:t>
       </w:r>
       <w:r>
         <w:rPr>
-          <w:b/>
-        </w:rPr>
-        <w:t>estático y conservador</w:t>
-      </w:r>
-      <w:r>
-        <w:t>: se calcula una sola vez, para un caso extremo y con márgenes fijos. No tiene en cuenta la degradación durante la explotación: envejecimiento de la fibra y de los amplificadores EDFA, empalmes por reparaciones o variaciones de temperatura. Tampoco recoge el hielo y las inundaciones, que el propio proyecto identifica como riesgos del trazado, ni la reconfiguración de canales en los OADM. Recalcular a mano cada canal óptico (</w:t>
-      </w:r>
-      <w:r>
-        <w:rPr>
+          <w:b w:val="0"/>
           <w:i/>
         </w:rPr>
         <w:t>lightpath</w:t>
       </w:r>
       <w:r>
+        <w:rPr>
+          <w:b w:val="0"/>
+          <w:i w:val="0"/>
+        </w:rPr>
         <w:t>) en cada situación es costoso, y los márgenes fijos tienden a sobredimensionar la red.</w:t>
       </w:r>
     </w:p>
     <w:p>
       <w:pPr>
         <w:keepNext/>
-        <w:spacing w:before="120" w:after="20"/>
+        <w:spacing w:before="140" w:after="40"/>
+        <w:jc w:val="left"/>
       </w:pPr>
       <w:r>
         <w:rPr>
           <w:b/>
-          <w:smallCaps/>
-          <w:sz w:val="20"/>
+          <w:i w:val="0"/>
         </w:rPr>
-        <w:t>2. Pregunta inicial de investigación</w:t>
+        <w:t>2. PREGUNTA INICIAL DE INVESTIGACIÓN</w:t>
       </w:r>
     </w:p>
     <w:p>
       <w:pPr>
-        <w:pBdr>
-          <w:top w:val="single" w:sz="6" w:space="3" w:color="000000"/>
-          <w:left w:val="single" w:sz="6" w:space="3" w:color="000000"/>
-          <w:bottom w:val="single" w:sz="6" w:space="3" w:color="000000"/>
-          <w:right w:val="single" w:sz="6" w:space="3" w:color="000000"/>
-        </w:pBdr>
-        <w:ind w:left="85" w:right="85"/>
+        <w:ind w:firstLine="709"/>
         <w:jc w:val="both"/>
       </w:pPr>
       <w:r>
-        <w:t>¿Puede un modelo de aprendizaje automático, entrenado con parámetros de enlace a los que accede el operador, estimar el factor Q y la BER de todos los canales de la red ferroviaria con una precisión comparable al modelo analítico, en mucho menos tiempo y también en condiciones degradadas?</w:t>
+        <w:rPr>
+          <w:b w:val="0"/>
+          <w:i w:val="0"/>
+        </w:rPr>
+        <w:t>¿Puede un modelo de aprendizaje automático, entrenado con parámetros observables de los enlaces, predecir si cada canal de la red ferroviaria cumple el umbral de calidad BER ≤ 10</w:t>
+      </w:r>
+      <w:r>
+        <w:rPr>
+          <w:b w:val="0"/>
+          <w:i w:val="0"/>
+          <w:vertAlign w:val="superscript"/>
+        </w:rPr>
+        <w:t>−11</w:t>
+      </w:r>
+      <w:r>
+        <w:rPr>
+          <w:b w:val="0"/>
+          <w:i w:val="0"/>
+        </w:rPr>
+        <w:t xml:space="preserve"> en condiciones de degradación, con más acierto que un modelo sencillo y con menos margen de diseño que el criterio fijo del proyecto?</w:t>
       </w:r>
     </w:p>
     <w:p>
       <w:pPr>
         <w:keepNext/>
-        <w:spacing w:before="120" w:after="20"/>
+        <w:spacing w:before="140" w:after="40"/>
+        <w:jc w:val="left"/>
       </w:pPr>
       <w:r>
         <w:rPr>
           <w:b/>
-          <w:smallCaps/>
-          <w:sz w:val="20"/>
+          <w:i w:val="0"/>
         </w:rPr>
-        <w:t>3. Novedad e interés</w:t>
+        <w:t>3. NOVEDAD E INTERÉS</w:t>
       </w:r>
     </w:p>
     <w:p>
       <w:pPr>
-        <w:pStyle w:val="ListBullet"/>
+        <w:ind w:firstLine="709"/>
         <w:jc w:val="both"/>
       </w:pPr>
       <w:r>
         <w:rPr>
+          <w:b w:val="0"/>
+          <w:i w:val="0"/>
+        </w:rPr>
+        <w:t xml:space="preserve">• </w:t>
+      </w:r>
+      <w:r>
+        <w:rPr>
           <w:b/>
+          <w:i w:val="0"/>
         </w:rPr>
         <w:t xml:space="preserve">Vacío: </w:t>
       </w:r>
       <w:r>
-        <w:t xml:space="preserve">la estimación de QoT con aprendizaje automático está consolidada en redes troncales de larga distancia [1–3]. Su aplicación a </w:t>
+        <w:rPr>
+          <w:b w:val="0"/>
+          <w:i w:val="0"/>
+        </w:rPr>
+        <w:t>la estimación de QoT con aprendizaje automático está consolidada en redes troncales de larga distancia [1, 2], incluso con modelos entrenados con datos sintéticos [3]. Sin embargo, no se han encontrado trabajos que la apliquen a redes de comunicaciones ferroviarias, lo que se confirmará en la revisión bibliográfica del Paso 2. Estas redes son regionales, con muchas estaciones de acceso, expuestas a condiciones ambientales severas y, en este caso, limitadas a equipos de fabricación nacional.</w:t>
+      </w:r>
+    </w:p>
+    <w:p>
+      <w:pPr>
+        <w:ind w:firstLine="709"/>
+        <w:jc w:val="both"/>
+      </w:pPr>
+      <w:r>
+        <w:rPr>
+          <w:b w:val="0"/>
+          <w:i w:val="0"/>
+        </w:rPr>
+        <w:t xml:space="preserve">• </w:t>
       </w:r>
       <w:r>
         <w:rPr>
           <w:b/>
-        </w:rPr>
-        <w:t>redes de comunicaciones ferroviarias</w:t>
-      </w:r>
-      <w:r>
-        <w:t xml:space="preserve"> parece mucho menos tratada, lo que se confirmará en la revisión bibliográfica del Paso 2. Estas redes son regionales, con muchas estaciones de acceso, expuestas a condiciones ambientales severas y, en este caso, limitadas a equipos de fabricación nacional.</w:t>
-      </w:r>
-    </w:p>
-    <w:p>
-      <w:pPr>
-        <w:pStyle w:val="ListBullet"/>
-        <w:jc w:val="both"/>
-      </w:pPr>
-      <w:r>
-        <w:rPr>
-          <w:b/>
+          <w:i w:val="0"/>
         </w:rPr>
         <w:t xml:space="preserve">Interés: </w:t>
       </w:r>
       <w:r>
+        <w:rPr>
+          <w:b w:val="0"/>
+          <w:i w:val="0"/>
+        </w:rPr>
         <w:t>se sustituye un cálculo puntual por un sistema inteligente que evalúa la red de forma continua. Es un paso hacia la gestión autónoma de redes y el mantenimiento predictivo de una infraestructura crítica para la seguridad ferroviaria.</w:t>
       </w:r>
     </w:p>
     <w:p>
       <w:pPr>
         <w:keepNext/>
-        <w:spacing w:before="120" w:after="20"/>
+        <w:spacing w:before="140" w:after="40"/>
+        <w:jc w:val="left"/>
       </w:pPr>
       <w:r>
         <w:rPr>
           <w:b/>
-          <w:smallCaps/>
-          <w:sz w:val="20"/>
+          <w:i w:val="0"/>
         </w:rPr>
-        <w:t>4. Objetivos</w:t>
+        <w:t>4. OBJETIVOS</w:t>
       </w:r>
     </w:p>
     <w:p>
       <w:pPr>
+        <w:ind w:firstLine="709"/>
         <w:jc w:val="both"/>
       </w:pPr>
       <w:r>
         <w:rPr>
           <w:b/>
+          <w:i w:val="0"/>
         </w:rPr>
         <w:t xml:space="preserve">General: </w:t>
       </w:r>
       <w:r>
+        <w:rPr>
+          <w:b w:val="0"/>
+          <w:i w:val="0"/>
+        </w:rPr>
         <w:t>desarrollar y evaluar un estimador de QoT basado en aprendizaje automático para la red DWDM del tramo Moscú-Kazánskaya – Riazán.</w:t>
       </w:r>
     </w:p>
     <w:p>
       <w:pPr>
-        <w:pStyle w:val="ListNumber"/>
+        <w:ind w:firstLine="709"/>
         <w:jc w:val="both"/>
       </w:pPr>
       <w:r>
-        <w:t>Construir un conjunto de datos de canales ópticos de la red a partir del modelo analítico del proyecto de grado, incluyendo condiciones de degradación.</w:t>
+        <w:rPr>
+          <w:b w:val="0"/>
+          <w:i w:val="0"/>
+        </w:rPr>
+        <w:t>1. Construir un conjunto de datos de canales ópticos de la red con un modelo físico de transmisión basado en el del proyecto, incluyendo condiciones de degradación.</w:t>
       </w:r>
     </w:p>
     <w:p>
       <w:pPr>
-        <w:pStyle w:val="ListNumber"/>
+        <w:ind w:firstLine="709"/>
         <w:jc w:val="both"/>
       </w:pPr>
       <w:r>
-        <w:t>Entrenar y comparar distintos modelos de aprendizaje automático con un modelo de referencia sencillo.</w:t>
+        <w:rPr>
+          <w:b w:val="0"/>
+          <w:i w:val="0"/>
+        </w:rPr>
+        <w:t>2. Entrenar y comparar distintos modelos de aprendizaje automático con un modelo de referencia sencillo.</w:t>
       </w:r>
     </w:p>
     <w:p>
       <w:pPr>
-        <w:pStyle w:val="ListNumber"/>
+        <w:ind w:firstLine="709"/>
         <w:jc w:val="both"/>
       </w:pPr>
       <w:r>
-        <w:t>Evaluar su precisión y su tiempo de cálculo frente al método analítico.</w:t>
+        <w:rPr>
+          <w:b w:val="0"/>
+          <w:i w:val="0"/>
+        </w:rPr>
+        <w:t>3. Evaluar su acierto en canales y condiciones no vistos durante el entrenamiento.</w:t>
       </w:r>
     </w:p>
     <w:p>
       <w:pPr>
-        <w:pStyle w:val="ListNumber"/>
+        <w:ind w:firstLine="709"/>
         <w:jc w:val="both"/>
       </w:pPr>
       <w:r>
-        <w:t>Analizar si la estimación permitiría ajustar los márgenes de diseño de la red.</w:t>
+        <w:rPr>
+          <w:b w:val="0"/>
+          <w:i w:val="0"/>
+        </w:rPr>
+        <w:t>4. Cuantificar el margen de diseño que podría ahorrarse sin incumplir el umbral de BER.</w:t>
       </w:r>
     </w:p>
     <w:p>
       <w:pPr>
         <w:keepNext/>
-        <w:spacing w:before="120" w:after="20"/>
+        <w:spacing w:before="140" w:after="40"/>
+        <w:jc w:val="left"/>
       </w:pPr>
       <w:r>
         <w:rPr>
           <w:b/>
-          <w:smallCaps/>
-          <w:sz w:val="20"/>
+          <w:i w:val="0"/>
         </w:rPr>
-        <w:t>5. Hipótesis provisional</w:t>
+        <w:t>5. HIPÓTESIS PROVISIONAL</w:t>
       </w:r>
     </w:p>
     <w:p>
       <w:pPr>
-        <w:pBdr>
-          <w:top w:val="single" w:sz="6" w:space="3" w:color="000000"/>
-          <w:left w:val="single" w:sz="6" w:space="3" w:color="000000"/>
-          <w:bottom w:val="single" w:sz="6" w:space="3" w:color="000000"/>
-          <w:right w:val="single" w:sz="6" w:space="3" w:color="000000"/>
-        </w:pBdr>
-        <w:spacing/>
-        <w:ind w:left="85" w:right="85"/>
+        <w:ind w:firstLine="709"/>
         <w:jc w:val="both"/>
       </w:pPr>
       <w:r>
         <w:rPr>
           <w:b w:val="0"/>
+          <w:i w:val="0"/>
         </w:rPr>
-        <w:t>Si se entrena un modelo de aprendizaje automático con los parámetros de los enlaces de la red (longitud, atenuación, empalmes, potencia y envejecimiento), será posible determinar si un canal cumple el umbral BER ≤ 10</w:t>
+        <w:t xml:space="preserve">Si se entrena un modelo de ensamble (por ejemplo, </w:t>
       </w:r>
       <w:r>
         <w:rPr>
+          <w:b w:val="0"/>
+          <w:i/>
+        </w:rPr>
+        <w:t>Random Forest</w:t>
+      </w:r>
+      <w:r>
+        <w:rPr>
+          <w:b w:val="0"/>
+          <w:i w:val="0"/>
+        </w:rPr>
+        <w:t>) con parámetros observables de los enlaces, será posible predecir si un canal cumple el umbral BER ≤ 10</w:t>
+      </w:r>
+      <w:r>
+        <w:rPr>
+          <w:b w:val="0"/>
+          <w:i w:val="0"/>
           <w:vertAlign w:val="superscript"/>
         </w:rPr>
         <w:t>−11</w:t>
       </w:r>
       <w:r>
-        <w:t xml:space="preserve"> con una exactitud comparable a la del cálculo analítico y en un tiempo de cálculo mucho menor.</w:t>
+        <w:rPr>
+          <w:b w:val="0"/>
+          <w:i w:val="0"/>
+        </w:rPr>
+        <w:t xml:space="preserve"> con mayor acierto que un modelo lineal sencillo y con menos margen de diseño que el criterio fijo del proyecto.</w:t>
       </w:r>
     </w:p>
     <w:p>
       <w:pPr>
+        <w:ind w:firstLine="709"/>
         <w:jc w:val="both"/>
       </w:pPr>
       <w:r>
         <w:rPr>
           <w:b/>
+          <w:i w:val="0"/>
         </w:rPr>
         <w:t xml:space="preserve">Limitación prevista: </w:t>
       </w:r>
       <w:r>
-        <w:t>el conjunto de datos será sintético, generado con el modelo físico del proyecto, y no con mediciones reales del operador. La validez externa deberá contrastarse con conjuntos de datos públicos de QoT.</w:t>
+        <w:rPr>
+          <w:b w:val="0"/>
+          <w:i w:val="0"/>
+        </w:rPr>
+        <w:t>el conjunto de datos será sintético, generado con un modelo físico, y no con mediciones reales del operador. La validez externa deberá contrastarse con conjuntos de datos públicos de QoT.</w:t>
       </w:r>
     </w:p>
     <w:p>
       <w:pPr>
-        <w:pBdr>
-          <w:top w:val="single" w:sz="4" w:space="3" w:color="000000"/>
-        </w:pBdr>
-        <w:spacing w:after="10" w:before="100"/>
+        <w:spacing w:before="140" w:after="40"/>
+        <w:jc w:val="left"/>
       </w:pPr>
       <w:r>
         <w:rPr>
-          <w:sz w:val="15"/>
+          <w:b/>
+          <w:i w:val="0"/>
+        </w:rPr>
+        <w:t>REFERENCIAS</w:t>
+      </w:r>
+    </w:p>
+    <w:p>
+      <w:pPr>
+        <w:ind w:left="220" w:hanging="220"/>
+        <w:jc w:val="left"/>
+      </w:pPr>
+      <w:r>
+        <w:rPr>
+          <w:b w:val="0"/>
+          <w:i w:val="0"/>
+          <w:sz w:val="18"/>
         </w:rPr>
         <w:t xml:space="preserve">[1] Pointurier, Y. (2021). Machine learning techniques for quality of transmission estimation in optical networks. </w:t>
       </w:r>
       <w:r>
         <w:rPr>
+          <w:b w:val="0"/>
           <w:i/>
-          <w:sz w:val="15"/>
+          <w:sz w:val="18"/>
         </w:rPr>
         <w:t>Journal of Optical Communications and Networking</w:t>
       </w:r>
       <w:r>
         <w:rPr>
-          <w:sz w:val="15"/>
+          <w:b w:val="0"/>
+          <w:i w:val="0"/>
+          <w:sz w:val="18"/>
         </w:rPr>
         <w:t>, 13(4), B60. https://doi.org/10.1364/JOCN.417434</w:t>
       </w:r>
     </w:p>
     <w:p>
       <w:pPr>
-        <w:spacing w:after="10"/>
+        <w:ind w:left="220" w:hanging="220"/>
+        <w:jc w:val="left"/>
       </w:pPr>
       <w:r>
         <w:rPr>
-          <w:sz w:val="15"/>
+          <w:b w:val="0"/>
+          <w:i w:val="0"/>
+          <w:sz w:val="18"/>
         </w:rPr>
-        <w:t xml:space="preserve">[2] Mata, J., de Miguel, I., Durán Barroso, R. J., et al. (2018). Supervised machine learning techniques for quality of transmission assessment in optical networks. </w:t>
+        <w:t xml:space="preserve">[2] Kozdrowski, S., Cichosz, P., Paziewski, P., &amp; Sujecki, S. (2021). Machine learning algorithms for prediction of the quality of transmission in optical networks. </w:t>
       </w:r>
       <w:r>
         <w:rPr>
+          <w:b w:val="0"/>
           <w:i/>
-          <w:sz w:val="15"/>
-        </w:rPr>
-        <w:t>ICTON 2018</w:t>
-      </w:r>
-      <w:r>
-        <w:rPr>
-          <w:sz w:val="15"/>
-        </w:rPr>
-        <w:t>, 1–4. IEEE. https://doi.org/10.1109/ICTON.2018.8473819</w:t>
-      </w:r>
-    </w:p>
-    <w:p>
-      <w:pPr>
-        <w:spacing w:after="10"/>
-      </w:pPr>
-      <w:r>
-        <w:rPr>
-          <w:sz w:val="15"/>
-        </w:rPr>
-        <w:t xml:space="preserve">[3] Kozdrowski, S., Cichosz, P., Paziewski, P., &amp; Sujecki, S. (2020). Machine learning algorithms for prediction of the quality of transmission in optical networks. </w:t>
-      </w:r>
-      <w:r>
-        <w:rPr>
-          <w:i/>
-          <w:sz w:val="15"/>
+          <w:sz w:val="18"/>
         </w:rPr>
         <w:t>Entropy</w:t>
       </w:r>
       <w:r>
         <w:rPr>
-          <w:sz w:val="15"/>
+          <w:b w:val="0"/>
+          <w:i w:val="0"/>
+          <w:sz w:val="18"/>
         </w:rPr>
         <w:t>, 23(1), 7. https://doi.org/10.3390/e23010007</w:t>
       </w:r>
     </w:p>
+    <w:p>
+      <w:pPr>
+        <w:ind w:left="220" w:hanging="220"/>
+        <w:jc w:val="left"/>
+      </w:pPr>
+      <w:r>
+        <w:rPr>
+          <w:b w:val="0"/>
+          <w:i w:val="0"/>
+          <w:sz w:val="18"/>
+        </w:rPr>
+        <w:t xml:space="preserve">[3] Rottondi, C., Barletta, L., Giusti, A., &amp; Tornatore, M. (2018). Machine-learning method for quality of transmission prediction of unestablished lightpaths. </w:t>
+      </w:r>
+      <w:r>
+        <w:rPr>
+          <w:b w:val="0"/>
+          <w:i/>
+          <w:sz w:val="18"/>
+        </w:rPr>
+        <w:t>Journal of Optical Communications and Networking</w:t>
+      </w:r>
+      <w:r>
+        <w:rPr>
+          <w:b w:val="0"/>
+          <w:i w:val="0"/>
+          <w:sz w:val="18"/>
+        </w:rPr>
+        <w:t>, 10(2), A286. https://doi.org/10.1364/JOCN.10.00A286</w:t>
+      </w:r>
+    </w:p>
     <w:sectPr>
       <w:pgSz w:w="11906" w:h="16838"/>
-      <w:pgMar w:top="794" w:right="907" w:bottom="680" w:left="907" w:header="720" w:footer="720" w:gutter="0"/>
+      <w:pgMar w:top="964" w:right="1134" w:bottom="850" w:left="1134" w:header="720" w:footer="720" w:gutter="0"/>
       <w:cols w:space="720"/>
       <w:docGrid w:linePitch="360"/>
     </w:sectPr>
@@ -766,11 +890,11 @@
     <w:qFormat/>
     <w:rsid w:val="00FC693F"/>
     <w:pPr>
-      <w:spacing w:after="40" w:before="0" w:line="252" w:lineRule="auto"/>
+      <w:spacing w:after="0" w:before="0" w:line="264" w:lineRule="auto"/>
     </w:pPr>
     <w:rPr>
       <w:rFonts w:ascii="Times New Roman" w:hAnsi="Times New Roman" w:eastAsia="Times New Roman"/>
-      <w:sz w:val="19"/>
+      <w:sz w:val="22"/>
     </w:rPr>
   </w:style>
   <w:style w:type="paragraph" w:styleId="Header">

</xml_diff>

<commit_message>
Ficha Paso 1: hipótesis sin cláusula de margen, términos más claros y limitación reescrita
Co-Authored-By: Claude Opus 5.5 <noreply@anthropic.com>
Claude-Session: https://claude.ai/code/session_01QswC6zmgxEZXx5t9M6nqcy
</commit_message>
<xml_diff>
--- a/master-sistemas-inteligentes/metodologia-de-la-investigacion/practica-del-problema-al-articulo/paso-1-planteamiento/ficha-paso-1.docx
+++ b/master-sistemas-inteligentes/metodologia-de-la-investigacion/practica-del-problema-al-articulo/paso-1-planteamiento/ficha-paso-1.docx
@@ -165,7 +165,7 @@
           <w:b w:val="0"/>
           <w:i w:val="0"/>
         </w:rPr>
-        <w:t>¿Puede un modelo de aprendizaje automático, entrenado con parámetros observables de los enlaces, predecir si cada canal de la red ferroviaria cumple el umbral de calidad BER ≤ 10</w:t>
+        <w:t>¿Puede un modelo de aprendizaje automático, entrenado con parámetros que el operador puede medir, predecir si cada canal de la red ferroviaria cumple el umbral de calidad BER ≤ 10</w:t>
       </w:r>
       <w:r>
         <w:rPr>
@@ -180,7 +180,7 @@
           <w:b w:val="0"/>
           <w:i w:val="0"/>
         </w:rPr>
-        <w:t xml:space="preserve"> en condiciones de degradación, con más acierto que un modelo sencillo y con menos margen de diseño que el criterio fijo del proyecto?</w:t>
+        <w:t xml:space="preserve"> en condiciones de degradación, con más acierto que un modelo sencillo?</w:t>
       </w:r>
     </w:p>
     <w:p>
@@ -375,7 +375,7 @@
           <w:b w:val="0"/>
           <w:i w:val="0"/>
         </w:rPr>
-        <w:t>) con parámetros observables de los enlaces, será posible predecir si un canal cumple el umbral BER ≤ 10</w:t>
+        <w:t>) con parámetros que el operador puede medir, será posible predecir si un canal cumple el umbral BER ≤ 10</w:t>
       </w:r>
       <w:r>
         <w:rPr>
@@ -390,7 +390,7 @@
           <w:b w:val="0"/>
           <w:i w:val="0"/>
         </w:rPr>
-        <w:t xml:space="preserve"> con mayor acierto que un modelo lineal sencillo y con menos margen de diseño que el criterio fijo del proyecto.</w:t>
+        <w:t xml:space="preserve"> con mayor acierto que un modelo lineal sencillo.</w:t>
       </w:r>
     </w:p>
     <w:p>
@@ -410,7 +410,7 @@
           <w:b w:val="0"/>
           <w:i w:val="0"/>
         </w:rPr>
-        <w:t>el conjunto de datos será sintético, generado con un modelo físico, y no con mediciones reales del operador. La validez externa deberá contrastarse con conjuntos de datos públicos de QoT.</w:t>
+        <w:t>los datos no serán mediciones reales de la red, sino que se generarán por ordenador con ecuaciones físicas de transmisión óptica (datos sintéticos). Por ello, los resultados deberán contrastarse con conjuntos de datos públicos medidos en redes reales.</w:t>
       </w:r>
     </w:p>
     <w:p>

</xml_diff>